<commit_message>
docs: refresh Review 1 dossier v1.2 and 12-slide deck
Update 01/02/03/08, lab evidence status, NFR mapping and proposed error contract. Add 12 editable review slides using the original DFD; retain the historical 7-slide deck. PC-01 through PC-06, source flow corrections, raw lab logs and instructor review remain pending. No application test, pentest or main merge.
</commit_message>
<xml_diff>
--- a/docs/01_SRS_Yeu_cau_phan_mem.docx
+++ b/docs/01_SRS_Yeu_cau_phan_mem.docx
@@ -417,7 +417,7 @@
                 <w:b w:val="0"/>
                 <w:sz w:val="18"/>
               </w:rPr>
-              <w:t>v1.1 / 29-10-2026</w:t>
+              <w:t>v1.2 / 30-10-2026</w:t>
             </w:r>
           </w:p>
         </w:tc>
@@ -21672,7 +21672,7 @@
         <w:vertAlign w:val="baseline"/>
         <w:rtl w:val="0"/>
       </w:rPr>
-      <w:t xml:space="preserve">Group2  •  P01  •  SRS v1.1 / 29-10-2026  •  Trang </w:t>
+      <w:t xml:space="preserve">Group2  •  P01  •  SRS v1.2 / 30-10-2026  •  Trang </w:t>
     </w:r>
     <w:r>
       <w:rPr>

</xml_diff>